<commit_message>
Refina conclusiones provisionales y coherencia metodologica
</commit_message>
<xml_diff>
--- a/outputs/documentos_tfg/conclusiones_desarrolladas_tfg.docx
+++ b/outputs/documentos_tfg/conclusiones_desarrolladas_tfg.docx
@@ -37,7 +37,7 @@
           <w:rFonts w:ascii="Times New Roman" w:hAnsi="Times New Roman"/>
           <w:sz w:val="24"/>
         </w:rPr>
-        <w:t>El inventario de ciclo de vida representó y cuantificó las rutas diferenciadas de manejo del estiércol en los dos escenarios, a partir de un flujo anual común de 26 278,725181 kg de estiércol fresco. En el Escenario A, 66,69 % se destinó a precomposteo y lombricompostaje, mientras 33,31 % se incorporó a las aguas verdes; en el Escenario B, el 100 % ingresó al sistema de purines. De este modo, el inventario caracterizó las trayectorias de manejo y los flujos asociados a cada alternativa estudiada.</w:t>
+        <w:t>El inventario de ciclo de vida representó y cuantificó las rutas diferenciadas de manejo del estiércol en los dos escenarios, a partir de un flujo anual común de 26 278,725181 kg de estiércol fresco. En el Escenario A, 66,69 % ingresó a la ruta sólida mediante A1: Precomposteo; posteriormente, la masa resultante continuó hacia A2: Lombricompostaje, mientras que 33,31 % se incorporó a las aguas verdes. En el Escenario B, el 100 % ingresó al sistema de purines. De este modo, el inventario caracterizó las trayectorias de manejo y los flujos asociados a cada alternativa estudiada.</w:t>
       </w:r>
     </w:p>
     <w:p>
@@ -51,7 +51,7 @@
           <w:rFonts w:ascii="Times New Roman" w:hAnsi="Times New Roman"/>
           <w:sz w:val="24"/>
         </w:rPr>
-        <w:t>Las cargas ambientales se concentraron en etapas específicas, que variaron según el escenario y la categoría. En calentamiento global, A3: Almacenamiento de aguas verdes aportó 69,36 % del total del Escenario A y B1: Almacenamiento de purines aportó 98,03 % del total del Escenario B. Para eutrofización, las mayores contribuciones correspondieron a A1: Precomposteo (52,45 % del total de A) y B1: Almacenamiento de purines (70,55 % del total de B). La evaluación por etapa identificó así patrones de concentración diferenciados entre las alternativas estudiadas.</w:t>
+        <w:t>Las cargas ambientales se concentraron en etapas específicas, que variaron según el escenario y la categoría. En calentamiento global, A3: Almacenamiento de aguas verdes aportó 69,36 % del total del Escenario A y B1: Almacenamiento de purines aportó 98,03 % del total del Escenario B. Para eutrofización, las mayores contribuciones correspondieron a A1: Precomposteo (52,45 % del total de A) y B1: Almacenamiento de purines (70,55 % del total de B), considerando el supuesto de representación del nitrógeno potencialmente eutrofizante adoptado en el estudio. La evaluación por etapa identificó así patrones de concentración diferenciados entre las alternativas estudiadas.</w:t>
       </w:r>
     </w:p>
     <w:p>
@@ -65,7 +65,7 @@
           <w:rFonts w:ascii="Times New Roman" w:hAnsi="Times New Roman"/>
           <w:sz w:val="24"/>
         </w:rPr>
-        <w:t>Para calentamiento global, el Escenario B presentó el mayor impacto por unidad funcional: 0,346 kg CO₂-eq/kg de estiércol fresco, frente a 0,163 kg CO₂-eq/kg en el Escenario A. La diferencia fue de 112,39 % respecto a A, lo que evidenció un menor indicador para el Escenario A bajo las condiciones estudiadas.</w:t>
+        <w:t>Para calentamiento global, el Escenario B presentó el mayor impacto por unidad funcional: 0,346 kg CO₂-eq/kg de estiércol fresco manejado, frente a 0,163 kg CO₂-eq/kg de estiércol fresco manejado en el Escenario A. La diferencia fue de 112,39 % respecto a A, lo que evidenció un menor indicador para el Escenario A bajo las condiciones estudiadas.</w:t>
       </w:r>
     </w:p>
     <w:p>
@@ -79,7 +79,7 @@
           <w:rFonts w:ascii="Times New Roman" w:hAnsi="Times New Roman"/>
           <w:sz w:val="24"/>
         </w:rPr>
-        <w:t>Para eutrofización, el Escenario B también presentó el mayor impacto por unidad funcional: 0,000769 kg PO₄-eq/kg de estiércol fresco, en comparación con 0,000660 kg PO₄-eq/kg en el Escenario A. La diferencia de 16,43 % respecto a A mostró que el Escenario A también alcanzó el menor indicador de eutrofización en el sistema evaluado.</w:t>
+        <w:t>Para eutrofización, el Escenario B también presentó el mayor impacto por unidad funcional: 0,000769 kg PO₄-eq/kg de estiércol fresco manejado, en comparación con 0,000660 kg PO₄-eq/kg de estiércol fresco manejado en el Escenario A. Bajo el supuesto de representación del nitrógeno potencialmente eutrofizante adoptado en el estudio, la diferencia de 16,43 % respecto a A mostró que el Escenario A también alcanzó el menor indicador de eutrofización en el sistema evaluado.</w:t>
       </w:r>
     </w:p>
     <w:p>
@@ -93,7 +93,7 @@
           <w:rFonts w:ascii="Times New Roman" w:hAnsi="Times New Roman"/>
           <w:sz w:val="24"/>
         </w:rPr>
-        <w:t>En conjunto, el ACV permitió estimar el desempeño ambiental de las dos alternativas de manejo en la lechería estudiada. Bajo la misma unidad funcional y las condiciones modeladas, el Escenario A presentó menores indicadores que el Escenario B tanto para calentamiento global como para eutrofización. Este resultado se circunscribió al sistema evaluado y no implicó la superioridad universal de una alternativa en otras lecherías o condiciones operativas.</w:t>
+        <w:t>En conjunto, el ACV permitió estimar el desempeño ambiental de las dos alternativas de manejo en la lechería estudiada. Bajo la unidad funcional común de 1 kg de estiércol fresco manejado y las condiciones modeladas, el Escenario A presentó menores indicadores que el Escenario B tanto para calentamiento global como para eutrofización. Este resultado se circunscribió al sistema evaluado y no implicó la superioridad universal de una alternativa en otras lecherías o condiciones operativas.</w:t>
       </w:r>
     </w:p>
     <w:sectPr>

</xml_diff>

<commit_message>
Regenera documentos provisionales con corrida M1-M2
</commit_message>
<xml_diff>
--- a/outputs/documentos_tfg/conclusiones_desarrolladas_tfg.docx
+++ b/outputs/documentos_tfg/conclusiones_desarrolladas_tfg.docx
@@ -12,6 +12,35 @@
           <w:color w:val="000000"/>
         </w:rPr>
         <w:t>Conclusiones</w:t>
+      </w:r>
+    </w:p>
+    <w:p>
+      <w:pPr>
+        <w:spacing w:line="240" w:lineRule="auto" w:before="0" w:after="0"/>
+        <w:ind w:left="100" w:firstLine="719"/>
+        <w:jc w:val="both"/>
+      </w:pPr>
+      <w:r>
+        <w:rPr>
+          <w:rFonts w:ascii="Times New Roman" w:hAnsi="Times New Roman"/>
+          <w:b/>
+          <w:sz w:val="24"/>
+        </w:rPr>
+        <w:t>PROVISIONAL M1–M2</w:t>
+      </w:r>
+    </w:p>
+    <w:p>
+      <w:pPr>
+        <w:spacing w:line="240" w:lineRule="auto" w:before="0" w:after="0"/>
+        <w:ind w:left="100" w:firstLine="719"/>
+        <w:jc w:val="both"/>
+      </w:pPr>
+      <w:r>
+        <w:rPr>
+          <w:rFonts w:ascii="Times New Roman" w:hAnsi="Times New Roman"/>
+          <w:sz w:val="24"/>
+        </w:rPr>
+        <w:t>Estas conclusiones se derivan de la corrida provisional M1–M2 vigente. La incorporación de M3 actualizará la caracterización final y podrá modificar los resultados cuantitativos.</w:t>
       </w:r>
     </w:p>
     <w:p>
@@ -51,7 +80,7 @@
           <w:rFonts w:ascii="Times New Roman" w:hAnsi="Times New Roman"/>
           <w:sz w:val="24"/>
         </w:rPr>
-        <w:t>Las cargas ambientales se concentraron en etapas específicas, que variaron según el escenario y la categoría. En calentamiento global, A3: Almacenamiento de aguas verdes aportó 69,36 % del total del Escenario A y B1: Almacenamiento de purines aportó 98,03 % del total del Escenario B. Para eutrofización, las mayores contribuciones correspondieron a A1: Precomposteo (52,45 % del total de A) y B1: Almacenamiento de purines (70,55 % del total de B), considerando el supuesto de representación del nitrógeno potencialmente eutrofizante adoptado en el estudio. La evaluación por etapa identificó así patrones de concentración diferenciados entre las alternativas estudiadas.</w:t>
+        <w:t>Las cargas ambientales se concentraron en etapas específicas, que variaron según el escenario y la categoría. En calentamiento global, A3: Almacenamiento de aguas verdes aportó 62,13 % del total del Escenario A y B1: Almacenamiento de purines aportó 97,50 % del total del Escenario B. Para eutrofización, las mayores contribuciones correspondieron a A1: Precomposteo (53,27 % del total de A) y B1: Almacenamiento de purines (73,26 % del total de B), considerando el supuesto de representación del nitrógeno potencialmente eutrofizante adoptado en el estudio. La evaluación por etapa identificó así patrones de concentración diferenciados entre las alternativas estudiadas.</w:t>
       </w:r>
     </w:p>
     <w:p>
@@ -65,7 +94,7 @@
           <w:rFonts w:ascii="Times New Roman" w:hAnsi="Times New Roman"/>
           <w:sz w:val="24"/>
         </w:rPr>
-        <w:t>Para calentamiento global, el Escenario B presentó el mayor impacto por unidad funcional: 0,346 kg CO₂-eq/kg de estiércol fresco manejado, frente a 0,163 kg CO₂-eq/kg de estiércol fresco manejado en el Escenario A. La diferencia fue de 112,39 % respecto a A, lo que evidenció un menor indicador para el Escenario A bajo las condiciones estudiadas.</w:t>
+        <w:t>Para calentamiento global, el Escenario B presentó el mayor impacto por unidad funcional: 0,332 kg CO₂-eq/kg de estiércol fresco manejado, frente a 0,174 kg CO₂-eq/kg de estiércol fresco manejado en el Escenario A. La diferencia fue de 91,28 % respecto a A, lo que evidenció un menor indicador para el Escenario A bajo las condiciones estudiadas.</w:t>
       </w:r>
     </w:p>
     <w:p>
@@ -79,7 +108,7 @@
           <w:rFonts w:ascii="Times New Roman" w:hAnsi="Times New Roman"/>
           <w:sz w:val="24"/>
         </w:rPr>
-        <w:t>Para eutrofización, el Escenario B también presentó el mayor impacto por unidad funcional: 0,000769 kg PO₄-eq/kg de estiércol fresco manejado, en comparación con 0,000660 kg PO₄-eq/kg de estiércol fresco manejado en el Escenario A. Bajo el supuesto de representación del nitrógeno potencialmente eutrofizante adoptado en el estudio, la diferencia de 16,43 % respecto a A mostró que el Escenario A también alcanzó el menor indicador de eutrofización en el sistema evaluado.</w:t>
+        <w:t>Para eutrofización, el Escenario B también presentó el mayor impacto por unidad funcional: 0,001032 kg PO₄-eq/kg de estiércol fresco manejado, en comparación con 0,000906 kg PO₄-eq/kg de estiércol fresco manejado en el Escenario A. Bajo el supuesto de representación del nitrógeno potencialmente eutrofizante adoptado en el estudio, la diferencia de 13,88 % respecto a A mostró que el Escenario A también alcanzó el menor indicador de eutrofización en el sistema evaluado.</w:t>
       </w:r>
     </w:p>
     <w:p>
@@ -97,6 +126,7 @@
       </w:r>
     </w:p>
     <w:sectPr>
+      <w:headerReference w:type="default" r:id="rId9"/>
       <w:pgSz w:w="12240" w:h="15840"/>
       <w:pgMar w:top="1500" w:right="1320" w:bottom="280" w:left="1340" w:header="720" w:footer="720" w:gutter="0"/>
       <w:cols w:space="720"/>
@@ -104,6 +134,20 @@
     </w:sectPr>
   </w:body>
 </w:document>
+</file>
+
+<file path=word/header1.xml><?xml version="1.0" encoding="utf-8"?>
+<w:hdr xmlns:m="http://schemas.openxmlformats.org/officeDocument/2006/math" xmlns:mc="http://schemas.openxmlformats.org/markup-compatibility/2006" xmlns:mo="http://schemas.microsoft.com/office/mac/office/2008/main" xmlns:mv="urn:schemas-microsoft-com:mac:vml" xmlns:o="urn:schemas-microsoft-com:office:office" xmlns:r="http://schemas.openxmlformats.org/officeDocument/2006/relationships" xmlns:v="urn:schemas-microsoft-com:vml" xmlns:w10="urn:schemas-microsoft-com:office:word" xmlns:w14="http://schemas.microsoft.com/office/word/2010/wordml" xmlns:w="http://schemas.openxmlformats.org/wordprocessingml/2006/main" xmlns:wne="http://schemas.microsoft.com/office/word/2006/wordml" xmlns:wp14="http://schemas.microsoft.com/office/word/2010/wordprocessingDrawing" xmlns:wp="http://schemas.openxmlformats.org/drawingml/2006/wordprocessingDrawing" xmlns:wpc="http://schemas.microsoft.com/office/word/2010/wordprocessingCanvas" xmlns:wpg="http://schemas.microsoft.com/office/word/2010/wordprocessingGroup" xmlns:wpi="http://schemas.microsoft.com/office/word/2010/wordprocessingInk" xmlns:wps="http://schemas.microsoft.com/office/word/2010/wordprocessingShape" mc:Ignorable="w14 wp14">
+  <w:p>
+    <w:pPr>
+      <w:pStyle w:val="Header"/>
+      <w:jc w:val="center"/>
+    </w:pPr>
+    <w:r>
+      <w:t>PROVISIONAL M1–M2</w:t>
+    </w:r>
+  </w:p>
+</w:hdr>
 </file>
 
 <file path=word/numbering.xml><?xml version="1.0" encoding="utf-8"?>

</xml_diff>

<commit_message>
Implement A2 IPCC passive composting model
</commit_message>
<xml_diff>
--- a/outputs/documentos_tfg/conclusiones_desarrolladas_tfg.docx
+++ b/outputs/documentos_tfg/conclusiones_desarrolladas_tfg.docx
@@ -80,7 +80,7 @@
           <w:rFonts w:ascii="Times New Roman" w:hAnsi="Times New Roman"/>
           <w:sz w:val="24"/>
         </w:rPr>
-        <w:t>Las cargas ambientales se concentraron en etapas específicas, que variaron según el escenario y la categoría. En calentamiento global, A3: Almacenamiento de aguas verdes aportó 62,13 % del total del Escenario A y B1: Almacenamiento de purines aportó 97,50 % del total del Escenario B. Para eutrofización, las mayores contribuciones correspondieron a A1: Precomposteo (53,27 % del total de A) y B1: Almacenamiento de purines (73,26 % del total de B), considerando el supuesto de representación del nitrógeno potencialmente eutrofizante adoptado en el estudio. La evaluación por etapa identificó así patrones de concentración diferenciados entre las alternativas estudiadas.</w:t>
+        <w:t>Las cargas ambientales se concentraron en etapas específicas, que variaron según el escenario y la categoría. En calentamiento global, A3: Almacenamiento de aguas verdes aportó 53,66 % del total del Escenario A y B1: Almacenamiento de purines aportó 97,50 % del total del Escenario B. Para eutrofización, las mayores contribuciones correspondieron a A2: Lombricompostaje (59,45 % del total de A) y B1: Almacenamiento de purines (73,26 % del total de B), considerando el supuesto de representación del nitrógeno potencialmente eutrofizante adoptado en el estudio. La evaluación por etapa identificó así patrones de concentración diferenciados entre las alternativas estudiadas.</w:t>
       </w:r>
     </w:p>
     <w:p>
@@ -94,7 +94,7 @@
           <w:rFonts w:ascii="Times New Roman" w:hAnsi="Times New Roman"/>
           <w:sz w:val="24"/>
         </w:rPr>
-        <w:t>Para calentamiento global, el Escenario B presentó el mayor impacto por unidad funcional: 0,332 kg CO₂-eq/kg de estiércol fresco manejado, frente a 0,174 kg CO₂-eq/kg de estiércol fresco manejado en el Escenario A. La diferencia fue de 91,28 % respecto a A, lo que evidenció un menor indicador para el Escenario A bajo las condiciones estudiadas.</w:t>
+        <w:t>Para calentamiento global, el Escenario B presentó el mayor impacto por unidad funcional: 0,332 kg CO₂-eq/kg de estiércol fresco manejado, frente a 0,201 kg CO₂-eq/kg de estiércol fresco manejado en el Escenario A. La diferencia fue de 65,21 % respecto a A, lo que evidenció un menor indicador para el Escenario A bajo las condiciones estudiadas.</w:t>
       </w:r>
     </w:p>
     <w:p>
@@ -108,7 +108,7 @@
           <w:rFonts w:ascii="Times New Roman" w:hAnsi="Times New Roman"/>
           <w:sz w:val="24"/>
         </w:rPr>
-        <w:t>Para eutrofización, el Escenario B también presentó el mayor impacto por unidad funcional: 0,001032 kg PO₄-eq/kg de estiércol fresco manejado, en comparación con 0,000906 kg PO₄-eq/kg de estiércol fresco manejado en el Escenario A. Bajo el supuesto de representación del nitrógeno potencialmente eutrofizante adoptado en el estudio, la diferencia de 13,88 % respecto a A mostró que el Escenario A también alcanzó el menor indicador de eutrofización en el sistema evaluado.</w:t>
+        <w:t>Para eutrofización, el Escenario B también presentó el mayor impacto por unidad funcional: 0,001032 kg PO₄-eq/kg de estiércol fresco manejado, en comparación con 0,002234 kg PO₄-eq/kg de estiércol fresco manejado en el Escenario A. Bajo el supuesto de representación del nitrógeno potencialmente eutrofizante adoptado en el estudio, la diferencia de -53,82 % respecto a A mostró que el Escenario A también alcanzó el menor indicador de eutrofización en el sistema evaluado.</w:t>
       </w:r>
     </w:p>
     <w:p>

</xml_diff>

<commit_message>
feat: add experimental benchmark for A2 IPCC estimates
</commit_message>
<xml_diff>
--- a/outputs/documentos_tfg/conclusiones_desarrolladas_tfg.docx
+++ b/outputs/documentos_tfg/conclusiones_desarrolladas_tfg.docx
@@ -80,7 +80,7 @@
           <w:rFonts w:ascii="Times New Roman" w:hAnsi="Times New Roman"/>
           <w:sz w:val="24"/>
         </w:rPr>
-        <w:t>Las cargas ambientales se concentraron en etapas específicas, que variaron según el escenario y la categoría. En calentamiento global, A3: Almacenamiento de aguas verdes aportó 53,66 % del total del Escenario A y B1: Almacenamiento de purines aportó 97,50 % del total del Escenario B. Para eutrofización, las mayores contribuciones correspondieron a A2: Lombricompostaje (59,45 % del total de A) y B1: Almacenamiento de purines (73,26 % del total de B), considerando el supuesto de representación del nitrógeno potencialmente eutrofizante adoptado en el estudio. La evaluación por etapa identificó así patrones de concentración diferenciados entre las alternativas estudiadas.</w:t>
+        <w:t>Las cargas ambientales se concentraron en etapas específicas, que variaron según el escenario y la categoría. En calentamiento global, A3: Almacenamiento de aguas verdes aportó 63,42 % del total del Escenario A y B1: Almacenamiento de purines aportó 97,50 % del total del Escenario B. Para eutrofización, las mayores contribuciones correspondieron a A1: Precomposteo (40,88 % del total de A) y B1: Almacenamiento de purines (73,26 % del total de B), considerando el supuesto de representación del nitrógeno potencialmente eutrofizante adoptado en el estudio. La evaluación por etapa identificó así patrones de concentración diferenciados entre las alternativas estudiadas.</w:t>
       </w:r>
     </w:p>
     <w:p>
@@ -94,7 +94,7 @@
           <w:rFonts w:ascii="Times New Roman" w:hAnsi="Times New Roman"/>
           <w:sz w:val="24"/>
         </w:rPr>
-        <w:t>Para calentamiento global, el Escenario B presentó el mayor impacto por unidad funcional: 0,332 kg CO₂-eq/kg de estiércol fresco manejado, frente a 0,201 kg CO₂-eq/kg de estiércol fresco manejado en el Escenario A. La diferencia fue de 65,21 % respecto a A, lo que evidenció un menor indicador para el Escenario A bajo las condiciones estudiadas.</w:t>
+        <w:t>Para calentamiento global, el Escenario B presentó el mayor impacto por unidad funcional: 0,332 kg CO₂-eq/kg de estiércol fresco manejado, frente a 0,170 kg CO₂-eq/kg de estiércol fresco manejado en el Escenario A. La diferencia fue de 95,26 % respecto a A, lo que evidenció un menor indicador para el Escenario A bajo las condiciones estudiadas.</w:t>
       </w:r>
     </w:p>
     <w:p>
@@ -108,7 +108,7 @@
           <w:rFonts w:ascii="Times New Roman" w:hAnsi="Times New Roman"/>
           <w:sz w:val="24"/>
         </w:rPr>
-        <w:t>Para eutrofización, el Escenario B también presentó el mayor impacto por unidad funcional: 0,001032 kg PO₄-eq/kg de estiércol fresco manejado, en comparación con 0,002234 kg PO₄-eq/kg de estiércol fresco manejado en el Escenario A. Bajo el supuesto de representación del nitrógeno potencialmente eutrofizante adoptado en el estudio, la diferencia de -53,82 % respecto a A mostró que el Escenario A también alcanzó el menor indicador de eutrofización en el sistema evaluado.</w:t>
+        <w:t>Para eutrofización, el Escenario B también presentó el mayor impacto por unidad funcional: 0,001032 kg PO₄-eq/kg de estiércol fresco manejado, en comparación con 0,001181 kg PO₄-eq/kg de estiércol fresco manejado en el Escenario A. Bajo el supuesto de representación del nitrógeno potencialmente eutrofizante adoptado en el estudio, la diferencia de -12,60 % respecto a A mostró que el Escenario A también alcanzó el menor indicador de eutrofización en el sistema evaluado.</w:t>
       </w:r>
     </w:p>
     <w:p>

</xml_diff>

<commit_message>
Harden quantitative consistency in generated documents
</commit_message>
<xml_diff>
--- a/outputs/documentos_tfg/conclusiones_desarrolladas_tfg.docx
+++ b/outputs/documentos_tfg/conclusiones_desarrolladas_tfg.docx
@@ -94,7 +94,7 @@
           <w:rFonts w:ascii="Times New Roman" w:hAnsi="Times New Roman"/>
           <w:sz w:val="24"/>
         </w:rPr>
-        <w:t>Para calentamiento global, el Escenario B presentó el mayor impacto por unidad funcional: 0,332 kg CO₂-eq/kg de estiércol fresco manejado, frente a 0,170 kg CO₂-eq/kg de estiércol fresco manejado en el Escenario A. La diferencia fue de 95,26 % respecto a A, lo que evidenció un menor indicador para el Escenario A bajo las condiciones estudiadas.</w:t>
+        <w:t>Para calentamiento global, el Escenario B presentó el mayor impacto por unidad funcional: 0,332 kg CO₂-eq/kg de estiércol fresco manejado, frente a 0,170 kg CO₂-eq/kg de estiércol fresco manejado en el Escenario A. La diferencia B menos A fue de 95,26 % respecto a A, lo que evidenció un menor indicador para el Escenario A bajo las condiciones estudiadas.</w:t>
       </w:r>
     </w:p>
     <w:p>
@@ -108,7 +108,7 @@
           <w:rFonts w:ascii="Times New Roman" w:hAnsi="Times New Roman"/>
           <w:sz w:val="24"/>
         </w:rPr>
-        <w:t>Para eutrofización, el Escenario B también presentó el mayor impacto por unidad funcional: 0,001032 kg PO₄-eq/kg de estiércol fresco manejado, en comparación con 0,001181 kg PO₄-eq/kg de estiércol fresco manejado en el Escenario A. Bajo el supuesto de representación del nitrógeno potencialmente eutrofizante adoptado en el estudio, la diferencia de -12,60 % respecto a A mostró que el Escenario A también alcanzó el menor indicador de eutrofización en el sistema evaluado.</w:t>
+        <w:t>Para eutrofización, el Escenario A presentó el mayor impacto por unidad funcional: 0,001181 kg PO₄-eq/kg de estiércol fresco manejado, en comparación con 0,001032 kg PO₄-eq/kg de estiércol fresco manejado en el Escenario B. Bajo el supuesto de representación del nitrógeno potencialmente eutrofizante adoptado en el estudio, la diferencia B menos A fue de -12,60 % respecto a A y mostró que el Escenario B alcanzó el menor indicador de eutrofización en el sistema evaluado.</w:t>
       </w:r>
     </w:p>
     <w:p>
@@ -122,7 +122,7 @@
           <w:rFonts w:ascii="Times New Roman" w:hAnsi="Times New Roman"/>
           <w:sz w:val="24"/>
         </w:rPr>
-        <w:t>En conjunto, el ACV permitió estimar el desempeño ambiental de las dos alternativas de manejo en la lechería estudiada. Bajo la unidad funcional común de 1 kg de estiércol fresco manejado y las condiciones modeladas, el Escenario A presentó menores indicadores que el Escenario B tanto para calentamiento global como para eutrofización. Este resultado se circunscribió al sistema evaluado y no implicó la superioridad universal de una alternativa en otras lecherías o condiciones operativas.</w:t>
+        <w:t>En conjunto, el ACV permitió estimar el desempeño ambiental de las dos alternativas de manejo en la lechería estudiada. Bajo la unidad funcional común de 1 kg de estiércol fresco manejado y las condiciones modeladas, el Escenario A presentó el menor indicador de calentamiento global y el Escenario B presentó el menor indicador de eutrofización. Este resultado se circunscribió al sistema evaluado y no implicó la superioridad universal de una alternativa en otras lecherías o condiciones operativas.</w:t>
       </w:r>
     </w:p>
     <w:sectPr>

</xml_diff>

<commit_message>
feat: promote sequential reactive N ledger
</commit_message>
<xml_diff>
--- a/outputs/documentos_tfg/conclusiones_desarrolladas_tfg.docx
+++ b/outputs/documentos_tfg/conclusiones_desarrolladas_tfg.docx
@@ -80,7 +80,7 @@
           <w:rFonts w:ascii="Times New Roman" w:hAnsi="Times New Roman"/>
           <w:sz w:val="24"/>
         </w:rPr>
-        <w:t>Las cargas ambientales se concentraron en etapas específicas, que variaron según el escenario y la categoría. En calentamiento global, A3: Almacenamiento de aguas verdes aportó 63,42 % del total del Escenario A y B1: Almacenamiento de purines aportó 97,50 % del total del Escenario B. Para eutrofización, las mayores contribuciones correspondieron a A1: Precomposteo (40,88 % del total de A) y B1: Almacenamiento de purines (73,26 % del total de B), considerando el supuesto de representación del nitrógeno potencialmente eutrofizante adoptado en el estudio. La evaluación por etapa identificó así patrones de concentración diferenciados entre las alternativas estudiadas.</w:t>
+        <w:t>Las cargas ambientales se concentraron en etapas específicas, que variaron según el escenario y la categoría. En calentamiento global, A3: Almacenamiento de aguas verdes aportó 57,58 % del total del Escenario A y B1: Almacenamiento de purines aportó 84,61 % del total del Escenario B. Para eutrofización, las mayores contribuciones correspondieron a A4: Aplicación de aguas verdes en campos de pastoreo (44,98 % del total de A) y B2: Aplicación de purines en campo de pastoreo (74,28 % del total de B), considerando el supuesto de representación del nitrógeno potencialmente eutrofizante adoptado en el estudio. La evaluación por etapa identificó así patrones de concentración diferenciados entre las alternativas estudiadas.</w:t>
       </w:r>
     </w:p>
     <w:p>
@@ -94,7 +94,7 @@
           <w:rFonts w:ascii="Times New Roman" w:hAnsi="Times New Roman"/>
           <w:sz w:val="24"/>
         </w:rPr>
-        <w:t>Para calentamiento global, el Escenario B presentó el mayor impacto por unidad funcional: 0,332 kg CO₂-eq/kg de estiércol fresco manejado, frente a 0,170 kg CO₂-eq/kg de estiércol fresco manejado en el Escenario A. La diferencia B menos A fue de 95,26 % respecto a A, lo que evidenció un menor indicador para el Escenario A bajo las condiciones estudiadas.</w:t>
+        <w:t>Para calentamiento global, el Escenario B presentó el mayor impacto por unidad funcional: 0,181 kg CO₂-eq/kg de estiércol fresco manejado, frente a 0,089 kg CO₂-eq/kg de estiércol fresco manejado en el Escenario A. La diferencia B menos A fue de 104,29 % respecto a A, lo que evidenció un menor indicador para el Escenario A bajo las condiciones estudiadas.</w:t>
       </w:r>
     </w:p>
     <w:p>
@@ -108,7 +108,7 @@
           <w:rFonts w:ascii="Times New Roman" w:hAnsi="Times New Roman"/>
           <w:sz w:val="24"/>
         </w:rPr>
-        <w:t>Para eutrofización, el Escenario A presentó el mayor impacto por unidad funcional: 0,001181 kg PO₄-eq/kg de estiércol fresco manejado, en comparación con 0,001032 kg PO₄-eq/kg de estiércol fresco manejado en el Escenario B. Bajo el supuesto de representación del nitrógeno potencialmente eutrofizante adoptado en el estudio, la diferencia B menos A fue de -12,60 % respecto a A y mostró que el Escenario B alcanzó el menor indicador de eutrofización en el sistema evaluado.</w:t>
+        <w:t>Para eutrofización, el Escenario B presentó el mayor impacto por unidad funcional: 0,001369 kg PO₄-eq/kg de estiércol fresco manejado, en comparación con 0,000753 kg PO₄-eq/kg de estiércol fresco manejado en el Escenario A. Bajo el supuesto de representación del nitrógeno potencialmente eutrofizante adoptado en el estudio, la diferencia B menos A fue de 81,79 % respecto a A y mostró que el Escenario A alcanzó el menor indicador de eutrofización en el sistema evaluado.</w:t>
       </w:r>
     </w:p>
     <w:p>
@@ -122,7 +122,7 @@
           <w:rFonts w:ascii="Times New Roman" w:hAnsi="Times New Roman"/>
           <w:sz w:val="24"/>
         </w:rPr>
-        <w:t>En conjunto, el ACV permitió estimar el desempeño ambiental de las dos alternativas de manejo en la lechería estudiada. Bajo la unidad funcional común de 1 kg de estiércol fresco manejado y las condiciones modeladas, el Escenario A presentó el menor indicador de calentamiento global y el Escenario B presentó el menor indicador de eutrofización. Este resultado se circunscribió al sistema evaluado y no implicó la superioridad universal de una alternativa en otras lecherías o condiciones operativas.</w:t>
+        <w:t>En conjunto, el ACV permitió estimar el desempeño ambiental de las dos alternativas de manejo en la lechería estudiada. Bajo la unidad funcional común de 1 kg de estiércol fresco manejado y las condiciones modeladas, el Escenario A presentó el menor indicador de calentamiento global y el Escenario A presentó el menor indicador de eutrofización. Este resultado se circunscribió al sistema evaluado y no implicó la superioridad universal de una alternativa en otras lecherías o condiciones operativas.</w:t>
       </w:r>
     </w:p>
     <w:sectPr>

</xml_diff>

<commit_message>
Implementar EF 3.1 e inventario operativo canónico
</commit_message>
<xml_diff>
--- a/outputs/documentos_tfg/conclusiones_desarrolladas_tfg.docx
+++ b/outputs/documentos_tfg/conclusiones_desarrolladas_tfg.docx
@@ -66,7 +66,7 @@
           <w:rFonts w:ascii="Times New Roman" w:hAnsi="Times New Roman"/>
           <w:sz w:val="24"/>
         </w:rPr>
-        <w:t>El inventario de ciclo de vida representó y cuantificó las rutas diferenciadas de manejo del estiércol en los dos escenarios, a partir de un flujo anual común de 26 278,725181 kg de estiércol fresco. En el Escenario A, 66,69 % ingresó a la ruta sólida mediante A1: Precomposteo; posteriormente, la masa resultante continuó hacia A2: Lombricompostaje, mientras que 33,31 % se incorporó a las aguas verdes. En el Escenario B, el 100 % ingresó al sistema de purines. De este modo, el inventario caracterizó las trayectorias de manejo y los flujos asociados a cada alternativa estudiada.</w:t>
+        <w:t>El inventario de ciclo de vida representó y cuantificó las rutas diferenciadas de manejo del estiércol en los dos escenarios, a partir de un flujo anual común de 26 278,725181 kg de estiércol fresco. En el Escenario A, 66,69 % ingresó a la ruta sólida mediante A1: Precomposteo; posteriormente, la masa resultante continuó hacia A2: Lombricompostaje, mientras que 33,31 % se incorporó a las aguas verdes. En el Escenario B, el 100 % ingresó al sistema de purines. De este modo, el inventario caracterizó las trayectorias de manejo y los flujos asociados a cada alternativa estudiada. El inventario incorporó además 53,23 kWh/año de electricidad en A3 o B1 y 182,50 L/año de diésel en A4 o B2; sus procesos de fondo permanecen pendientes.</w:t>
       </w:r>
     </w:p>
     <w:p>
@@ -80,7 +80,7 @@
           <w:rFonts w:ascii="Times New Roman" w:hAnsi="Times New Roman"/>
           <w:sz w:val="24"/>
         </w:rPr>
-        <w:t>Las cargas ambientales se concentraron en etapas específicas, que variaron según el escenario y la categoría. En calentamiento global, A3: Almacenamiento de aguas verdes aportó 57,58 % del total del Escenario A y B1: Almacenamiento de purines aportó 84,61 % del total del Escenario B. Para eutrofización, las mayores contribuciones correspondieron a A4: Aplicación de aguas verdes en campos de pastoreo (44,98 % del total de A) y B2: Aplicación de purines en campo de pastoreo (74,28 % del total de B), considerando el supuesto de representación del nitrógeno potencialmente eutrofizante adoptado en el estudio. La evaluación por etapa identificó así patrones de concentración diferenciados entre las alternativas estudiadas.</w:t>
+        <w:t>Las cargas ambientales se concentraron en etapas específicas, que variaron según el escenario y la categoría. En calentamiento global, A3: Almacenamiento de aguas verdes aportó 63,53 % del total del Escenario A y B1: Almacenamiento de purines aportó 88,80 % del total del Escenario B. Para eutrofización, las mayores contribuciones correspondieron a A4: Aplicación de aguas verdes en campos de pastoreo (70,63 % del total de A) y B2: Aplicación de purines en campo de pastoreo (93,14 % del total de B), considerando el supuesto de representación del nitrógeno potencialmente eutrofizante adoptado en el estudio. La evaluación por etapa identificó así patrones de concentración diferenciados entre las alternativas estudiadas.</w:t>
       </w:r>
     </w:p>
     <w:p>
@@ -94,7 +94,7 @@
           <w:rFonts w:ascii="Times New Roman" w:hAnsi="Times New Roman"/>
           <w:sz w:val="24"/>
         </w:rPr>
-        <w:t>Para calentamiento global, el Escenario B presentó el mayor impacto por unidad funcional: 0,181 kg CO₂-eq/kg de estiércol fresco manejado, frente a 0,089 kg CO₂-eq/kg de estiércol fresco manejado en el Escenario A. La diferencia B menos A fue de 104,29 % respecto a A, lo que evidenció un menor indicador para el Escenario A bajo las condiciones estudiadas.</w:t>
+        <w:t>Para calentamiento global, el Escenario B presentó el mayor impacto por unidad funcional: 0,220 kg CO₂-eq/kg de estiércol fresco manejado, frente a 0,102 kg CO₂-eq/kg de estiércol fresco manejado en el Escenario A. La diferencia B menos A fue de 114,75 % respecto a A, lo que evidenció un menor indicador para el Escenario A bajo las condiciones estudiadas.</w:t>
       </w:r>
     </w:p>
     <w:p>
@@ -108,7 +108,7 @@
           <w:rFonts w:ascii="Times New Roman" w:hAnsi="Times New Roman"/>
           <w:sz w:val="24"/>
         </w:rPr>
-        <w:t>Para eutrofización, el Escenario B presentó el mayor impacto por unidad funcional: 0,001369 kg PO₄-eq/kg de estiércol fresco manejado, en comparación con 0,000753 kg PO₄-eq/kg de estiércol fresco manejado en el Escenario A. Bajo el supuesto de representación del nitrógeno potencialmente eutrofizante adoptado en el estudio, la diferencia B menos A fue de 81,79 % respecto a A y mostró que el Escenario A alcanzó el menor indicador de eutrofización en el sistema evaluado.</w:t>
+        <w:t>Para eutrofización marina EF 3.1, el Escenario B presentó el mayor impacto por unidad funcional: 0,001356 kg N-eq/kg de estiércol fresco manejado, frente a 0,000595 kg N-eq/kg en el Escenario A. La diferencia B menos A fue de 127,64 % respecto a A. La eutrofización terrestre se evaluó separadamente en mol N-eq.</w:t>
       </w:r>
     </w:p>
     <w:p>
@@ -122,7 +122,7 @@
           <w:rFonts w:ascii="Times New Roman" w:hAnsi="Times New Roman"/>
           <w:sz w:val="24"/>
         </w:rPr>
-        <w:t>En conjunto, el ACV permitió estimar el desempeño ambiental de las dos alternativas de manejo en la lechería estudiada. Bajo la unidad funcional común de 1 kg de estiércol fresco manejado y las condiciones modeladas, el Escenario A presentó el menor indicador de calentamiento global y el Escenario A presentó el menor indicador de eutrofización. Este resultado se circunscribió al sistema evaluado y no implicó la superioridad universal de una alternativa en otras lecherías o condiciones operativas.</w:t>
+        <w:t>En conjunto, el ACV permitió estimar el desempeño ambiental de las dos alternativas de manejo en la lechería estudiada. Bajo la unidad funcional común de 1 kg de estiércol fresco manejado y las condiciones modeladas, el Escenario A presentó el menor indicador de calentamiento global y el Escenario A presentó el menor indicador de eutrofización marina. Environmental Footprint 3.1 caracterizó las emisiones directas; la eutrofización terrestre se mantuvo separada en mol N-eq. Este resultado se circunscribió al sistema evaluado y no implicó la superioridad universal de una alternativa en otras lecherías o condiciones operativas.</w:t>
       </w:r>
     </w:p>
     <w:sectPr>

</xml_diff>

<commit_message>
Restaurar validaciones integrales de EF 3.1
</commit_message>
<xml_diff>
--- a/outputs/documentos_tfg/conclusiones_desarrolladas_tfg.docx
+++ b/outputs/documentos_tfg/conclusiones_desarrolladas_tfg.docx
@@ -108,7 +108,7 @@
           <w:rFonts w:ascii="Times New Roman" w:hAnsi="Times New Roman"/>
           <w:sz w:val="24"/>
         </w:rPr>
-        <w:t>Para eutrofización marina EF 3.1, el Escenario B presentó el mayor impacto por unidad funcional: 0,001356 kg N-eq/kg de estiércol fresco manejado, frente a 0,000595 kg N-eq/kg en el Escenario A. La diferencia B menos A fue de 127,64 % respecto a A. La eutrofización terrestre se evaluó separadamente en mol N-eq.</w:t>
+        <w:t>Para eutrofización marina EF 3.1, el Escenario B presentó el mayor impacto por unidad funcional: 0,001356 kg N-eq/kg de estiércol fresco manejado, frente a 0,000595 kg N-eq/kg en el Escenario A. La diferencia B menos A fue de 127,64 % respecto a A. Para eutrofización terrestre, el Escenario B también presentó el mayor impacto por unidad funcional: 0,036580 mol N-eq/kg de estiércol fresco manejado, frente a 0,023481 mol N-eq/kg en el Escenario A; la diferencia B menos A fue de 55,78 % respecto a A.</w:t>
       </w:r>
     </w:p>
     <w:p>
@@ -122,7 +122,7 @@
           <w:rFonts w:ascii="Times New Roman" w:hAnsi="Times New Roman"/>
           <w:sz w:val="24"/>
         </w:rPr>
-        <w:t>En conjunto, el ACV permitió estimar el desempeño ambiental de las dos alternativas de manejo en la lechería estudiada. Bajo la unidad funcional común de 1 kg de estiércol fresco manejado y las condiciones modeladas, el Escenario A presentó el menor indicador de calentamiento global y el Escenario A presentó el menor indicador de eutrofización marina. Environmental Footprint 3.1 caracterizó las emisiones directas; la eutrofización terrestre se mantuvo separada en mol N-eq. Este resultado se circunscribió al sistema evaluado y no implicó la superioridad universal de una alternativa en otras lecherías o condiciones operativas.</w:t>
+        <w:t>En conjunto, el ACV permitió estimar el desempeño ambiental de las dos alternativas de manejo en la lechería estudiada. Bajo la unidad funcional común de 1 kg de estiércol fresco manejado y las condiciones modeladas, el Escenario A presentó el menor indicador de calentamiento global y el Escenario A presentó el menor indicador de eutrofización marina; el Escenario A presentó asimismo el menor indicador de eutrofización terrestre, expresado separadamente en mol N-eq. Environmental Footprint 3.1 caracterizó las emisiones directas. Este resultado se circunscribió al sistema evaluado y no implicó la superioridad universal de una alternativa en otras lecherías o condiciones operativas.</w:t>
       </w:r>
     </w:p>
     <w:sectPr>

</xml_diff>